<commit_message>
HACCP IGS Marotta: completa i dati dal DVR Rev. 0 del 02/07/2026
Co-Authored-By: Claude Opus 5.5 <noreply@anthropic.com>
Claude-Session: https://claude.ai/code/session_0141r6itvrqnqND36aWv4h2p
</commit_message>
<xml_diff>
--- a/haccp/HACCP_IGS_Marotta.docx
+++ b/haccp/HACCP_IGS_Marotta.docx
@@ -67,7 +67,7 @@
           <w:sz w:val="24"/>
           <w:szCs w:val="24"/>
         </w:rPr>
-        <w:t xml:space="preserve">Deposito, logistica e commercio all’ingrosso di prodotti alimentari e bevande confezionati non refrigerati</w:t>
+        <w:t xml:space="preserve">Piattaforma logistica – deposito, commercio all’ingrosso e al dettaglio di bevande e generi alimentari confezionati non refrigerati</w:t>
       </w:r>
     </w:p>
     <w:p>
@@ -94,27 +94,7 @@
           <w:sz w:val="22"/>
           <w:szCs w:val="22"/>
         </w:rPr>
-        <w:t xml:space="preserve">Sede operativa: </w:t>
-      </w:r>
-      <w:r>
-        <w:rPr>
-          <w:b/>
-          <w:bCs/>
-          <w:sz w:val="22"/>
-          <w:szCs w:val="22"/>
-          <w:highlight w:val="yellow"/>
-          <w:highlightCs w:val="yellow"/>
-        </w:rPr>
-        <w:t xml:space="preserve">Via ……, n. …</w:t>
-      </w:r>
-      <w:r>
-        <w:rPr>
-          <w:b/>
-          <w:bCs/>
-          <w:sz w:val="22"/>
-          <w:szCs w:val="22"/>
-        </w:rPr>
-        <w:t xml:space="preserve"> – 61037 Marotta di Mondolfo (PU)</w:t>
+        <w:t xml:space="preserve">Sede operativa: Via XXV Aprile s.n. – Loc. Marotta – 61037 Mondolfo (PU)</w:t>
       </w:r>
     </w:p>
     <w:p>
@@ -167,16 +147,7 @@
           <w:sz w:val="22"/>
           <w:szCs w:val="22"/>
         </w:rPr>
-        <w:t xml:space="preserve">Data di ultima revisione del Manuale: </w:t>
-      </w:r>
-      <w:r>
-        <w:rPr>
-          <w:sz w:val="22"/>
-          <w:szCs w:val="22"/>
-          <w:highlight w:val="yellow"/>
-          <w:highlightCs w:val="yellow"/>
-        </w:rPr>
-        <w:t xml:space="preserve">gg/mm/2026</w:t>
+        <w:t xml:space="preserve">Data di ultima revisione del Manuale: 02/07/2026</w:t>
       </w:r>
     </w:p>
     <w:p>
@@ -188,16 +159,7 @@
           <w:sz w:val="22"/>
           <w:szCs w:val="22"/>
         </w:rPr>
-        <w:t xml:space="preserve">Responsabile dell’autocontrollo: </w:t>
-      </w:r>
-      <w:r>
-        <w:rPr>
-          <w:sz w:val="22"/>
-          <w:szCs w:val="22"/>
-          <w:highlight w:val="yellow"/>
-          <w:highlightCs w:val="yellow"/>
-        </w:rPr>
-        <w:t xml:space="preserve">Nome e Cognome</w:t>
+        <w:t xml:space="preserve">Responsabile dell’autocontrollo: Sig. Infante Antonio</w:t>
       </w:r>
     </w:p>
     <w:p>
@@ -210,29 +172,7 @@
           <w:sz w:val="22"/>
           <w:szCs w:val="22"/>
         </w:rPr>
-        <w:t xml:space="preserve">Approvato: ______________________   (firma del legale rappresentante)</w:t>
-      </w:r>
-    </w:p>
-    <w:p>
-      <w:pPr>
-        <w:spacing w:before="300"/>
-        <w:jc w:val="left"/>
-      </w:pPr>
-      <w:r>
-        <w:rPr>
-          <w:sz w:val="22"/>
-          <w:szCs w:val="22"/>
-        </w:rPr>
-        <w:t xml:space="preserve">Redatto da: </w:t>
-      </w:r>
-      <w:r>
-        <w:rPr>
-          <w:sz w:val="22"/>
-          <w:szCs w:val="22"/>
-          <w:highlight w:val="yellow"/>
-          <w:highlightCs w:val="yellow"/>
-        </w:rPr>
-        <w:t xml:space="preserve">Nome, titolo e recapiti del consulente</w:t>
+        <w:t xml:space="preserve">Approvato: Sig. Infante Antonio – legale rappresentante      Firma: ______________________</w:t>
       </w:r>
     </w:p>
     <w:p>
@@ -1164,7 +1104,7 @@
                 <w:sz w:val="18"/>
                 <w:szCs w:val="18"/>
               </w:rPr>
-              <w:t xml:space="preserve">: deposito, logistica e commercio all’ingrosso di prodotti alimentari e bevande preconfezionati non refrigerati (acque minerali, bevande gassate e non gassate, succhi di frutta, vini, birre, liquori e superalcolici, generi alimentari confezionati a lunga conservazione). Ricevimento, stoccaggio, preparazione ordini e trasporto/consegna ai clienti. </w:t>
+              <w:t xml:space="preserve">: piattaforma logistica per la distribuzione di bevande (acque minerali, birre anche in fusti, bibite, vini e liquori) e generi alimentari confezionati non refrigerati, con area dedicata ai prodotti food (farine e semilavorati per pizzeria). Ricevimento, stoccaggio, preparazione ordini, carico automezzi e consegna a clienti (pubblici esercizi e dettaglio); zona di vendita al dettaglio aperta al pubblico. </w:t>
             </w:r>
             <w:r>
               <w:rPr>
@@ -1180,16 +1120,7 @@
                 <w:sz w:val="18"/>
                 <w:szCs w:val="18"/>
               </w:rPr>
-              <w:t xml:space="preserve"> si effettuano lavorazioni, sconfezionamenti o riconfezionamenti di alimenti. </w:t>
-            </w:r>
-            <w:r>
-              <w:rPr>
-                <w:sz w:val="18"/>
-                <w:szCs w:val="18"/>
-                <w:highlight w:val="yellow"/>
-                <w:highlightCs w:val="yellow"/>
-              </w:rPr>
-              <w:t xml:space="preserve">Verificare/integrare le categorie di prodotto</w:t>
+              <w:t xml:space="preserve"> si effettuano lavorazioni, sconfezionamenti o riconfezionamenti di alimenti.</w:t>
             </w:r>
           </w:p>
         </w:tc>
@@ -1224,23 +1155,7 @@
                 <w:sz w:val="18"/>
                 <w:szCs w:val="18"/>
               </w:rPr>
-              <w:t xml:space="preserve">Sede operativa: </w:t>
-            </w:r>
-            <w:r>
-              <w:rPr>
-                <w:sz w:val="18"/>
-                <w:szCs w:val="18"/>
-                <w:highlight w:val="yellow"/>
-                <w:highlightCs w:val="yellow"/>
-              </w:rPr>
-              <w:t xml:space="preserve">Via ……, n. …</w:t>
-            </w:r>
-            <w:r>
-              <w:rPr>
-                <w:sz w:val="18"/>
-                <w:szCs w:val="18"/>
-              </w:rPr>
-              <w:t xml:space="preserve"> – 61037 Marotta di Mondolfo (PU)</w:t>
+              <w:t xml:space="preserve">Sede operativa: Via XXV Aprile s.n. – Loc. Marotta – 61037 Mondolfo (PU)</w:t>
             </w:r>
           </w:p>
         </w:tc>
@@ -1345,16 +1260,7 @@
                 <w:sz w:val="18"/>
                 <w:szCs w:val="18"/>
               </w:rPr>
-              <w:t xml:space="preserve">Amministratore / legale rappresentante: </w:t>
-            </w:r>
-            <w:r>
-              <w:rPr>
-                <w:sz w:val="18"/>
-                <w:szCs w:val="18"/>
-                <w:highlight w:val="yellow"/>
-                <w:highlightCs w:val="yellow"/>
-              </w:rPr>
-              <w:t xml:space="preserve">Nome e Cognome</w:t>
+              <w:t xml:space="preserve">Legale rappresentante: Sig. Infante Antonio – Presidente del CdA e Amministratore Delegato</w:t>
             </w:r>
           </w:p>
         </w:tc>
@@ -1389,16 +1295,7 @@
                 <w:sz w:val="18"/>
                 <w:szCs w:val="18"/>
               </w:rPr>
-              <w:t xml:space="preserve">Preposto sede operativa di Marotta: </w:t>
-            </w:r>
-            <w:r>
-              <w:rPr>
-                <w:sz w:val="18"/>
-                <w:szCs w:val="18"/>
-                <w:highlight w:val="yellow"/>
-                <w:highlightCs w:val="yellow"/>
-              </w:rPr>
-              <w:t xml:space="preserve">Nome e Cognome</w:t>
+              <w:t xml:space="preserve">Organico della sede: n. 1 magazziniere/carrellista e n. 4 autisti consegnatari</w:t>
             </w:r>
           </w:p>
         </w:tc>
@@ -1433,16 +1330,7 @@
                 <w:sz w:val="18"/>
                 <w:szCs w:val="18"/>
               </w:rPr>
-              <w:t xml:space="preserve">Responsabile dell’autocontrollo: </w:t>
-            </w:r>
-            <w:r>
-              <w:rPr>
-                <w:sz w:val="18"/>
-                <w:szCs w:val="18"/>
-                <w:highlight w:val="yellow"/>
-                <w:highlightCs w:val="yellow"/>
-              </w:rPr>
-              <w:t xml:space="preserve">Nome e Cognome</w:t>
+              <w:t xml:space="preserve">Responsabile dell’autocontrollo: Sig. Infante Antonio</w:t>
             </w:r>
           </w:p>
         </w:tc>
@@ -1477,16 +1365,7 @@
                 <w:sz w:val="18"/>
                 <w:szCs w:val="18"/>
               </w:rPr>
-              <w:t xml:space="preserve">Consulente per l’autocontrollo: </w:t>
-            </w:r>
-            <w:r>
-              <w:rPr>
-                <w:sz w:val="18"/>
-                <w:szCs w:val="18"/>
-                <w:highlight w:val="yellow"/>
-                <w:highlightCs w:val="yellow"/>
-              </w:rPr>
-              <w:t xml:space="preserve">Nome, titolo e recapiti del consulente</w:t>
+              <w:t xml:space="preserve">Partita IVA / Codice Fiscale: 14727531007 – VAT europeo: IT14727531007</w:t>
             </w:r>
           </w:p>
         </w:tc>
@@ -1521,7 +1400,7 @@
                 <w:sz w:val="18"/>
                 <w:szCs w:val="18"/>
               </w:rPr>
-              <w:t xml:space="preserve">Partita IVA / Codice Fiscale: 14727531007 – VAT europeo: IT14727531007</w:t>
+              <w:t xml:space="preserve">REA: RM-1541680 – PEC: igs@pec.italianglobalsolution.it</w:t>
             </w:r>
           </w:p>
         </w:tc>
@@ -1556,51 +1435,7 @@
                 <w:sz w:val="18"/>
                 <w:szCs w:val="18"/>
               </w:rPr>
-              <w:t xml:space="preserve">REA: RM-1541680 – PEC: igs@pec.italianglobalsolution.it</w:t>
-            </w:r>
-          </w:p>
-        </w:tc>
-      </w:tr>
-      <w:tr>
-        <w:trPr>
-          <w:tblHeader w:val="false"/>
-        </w:trPr>
-        <w:tc>
-          <w:tcPr>
-            <w:tcW w:type="dxa" w:w="9638"/>
-            <w:tcBorders>
-              <w:top w:val="single" w:color="808080" w:sz="4"/>
-              <w:left w:val="single" w:color="808080" w:sz="4"/>
-              <w:bottom w:val="single" w:color="808080" w:sz="4"/>
-              <w:right w:val="single" w:color="808080" w:sz="4"/>
-            </w:tcBorders>
-            <w:tcMar>
-              <w:top w:type="dxa" w:w="50"/>
-              <w:left w:type="dxa" w:w="90"/>
-              <w:bottom w:type="dxa" w:w="50"/>
-              <w:right w:type="dxa" w:w="90"/>
-            </w:tcMar>
-            <w:vAlign w:val="center"/>
-          </w:tcPr>
-          <w:p>
-            <w:pPr>
-              <w:jc w:val="left"/>
-            </w:pPr>
-            <w:r>
-              <w:rPr>
-                <w:sz w:val="18"/>
-                <w:szCs w:val="18"/>
-              </w:rPr>
-              <w:t xml:space="preserve">Registrazione sanitaria sede di Marotta (art. 6 Reg. 852/2004 – SUAP Comune di Mondolfo / AST Pesaro-Urbino): </w:t>
-            </w:r>
-            <w:r>
-              <w:rPr>
-                <w:sz w:val="18"/>
-                <w:szCs w:val="18"/>
-                <w:highlight w:val="yellow"/>
-                <w:highlightCs w:val="yellow"/>
-              </w:rPr>
-              <w:t xml:space="preserve">n. e data</w:t>
+              <w:t xml:space="preserve">Autorità sanitaria competente: AST Pesaro e Urbino</w:t>
             </w:r>
           </w:p>
         </w:tc>
@@ -1620,21 +1455,20 @@
         <w:jc w:val="both"/>
       </w:pPr>
       <w:r>
+        <w:t xml:space="preserve">Fabbricato su due livelli in Via XXV Aprile s.n., Loc. Marotta di Mondolfo, con pavimentazione in resina/cemento lisciato e illuminazione naturale (lucernari) e artificiale.</w:t>
+      </w:r>
+    </w:p>
+    <w:p>
+      <w:pPr>
+        <w:spacing w:after="120" w:line="300"/>
+        <w:jc w:val="both"/>
+      </w:pPr>
+      <w:r>
         <w:rPr>
           <w:b/>
           <w:bCs/>
         </w:rPr>
         <w:t xml:space="preserve">AREE</w:t>
-      </w:r>
-      <w:r>
-        <w:t xml:space="preserve"> </w:t>
-      </w:r>
-      <w:r>
-        <w:rPr>
-          <w:highlight w:val="yellow"/>
-          <w:highlightCs w:val="yellow"/>
-        </w:rPr>
-        <w:t xml:space="preserve">verificare sulla planimetria</w:t>
       </w:r>
     </w:p>
     <w:p>
@@ -1648,7 +1482,7 @@
         <w:jc w:val="both"/>
       </w:pPr>
       <w:r>
-        <w:t xml:space="preserve">Piazzale e baie di carico/scarico</w:t>
+        <w:t xml:space="preserve">Piano terra: magazzino/deposito bevande con scaffalature metalliche portapallet su corsie parallele e zone di stoccaggio a catasta (pallet, fusti birra, casse in plastica)</w:t>
       </w:r>
     </w:p>
     <w:p>
@@ -1662,7 +1496,7 @@
         <w:jc w:val="both"/>
       </w:pPr>
       <w:r>
-        <w:t xml:space="preserve">Area ricevimento e controllo merci</w:t>
+        <w:t xml:space="preserve">Area dedicata ai prodotti food (farine e semilavorati per pizzeria)</w:t>
       </w:r>
     </w:p>
     <w:p>
@@ -1676,7 +1510,7 @@
         <w:jc w:val="both"/>
       </w:pPr>
       <w:r>
-        <w:t xml:space="preserve">Magazzino di stoccaggio con scaffalature porta-pallet</w:t>
+        <w:t xml:space="preserve">Zona vendita al dettaglio aperta al pubblico</w:t>
       </w:r>
     </w:p>
     <w:p>
@@ -1690,7 +1524,7 @@
         <w:jc w:val="both"/>
       </w:pPr>
       <w:r>
-        <w:t xml:space="preserve">Area preparazione ordini e spedizioni</w:t>
+        <w:t xml:space="preserve">Deposito bombole di anidride carbonica per impianti di spillatura (separato dagli alimenti)</w:t>
       </w:r>
     </w:p>
     <w:p>
@@ -1704,7 +1538,7 @@
         <w:jc w:val="both"/>
       </w:pPr>
       <w:r>
-        <w:t xml:space="preserve">Area segregata e identificata per resi e prodotti non conformi</w:t>
+        <w:t xml:space="preserve">Zona ricarica batterie dei mezzi elettrici (separata dagli alimenti)</w:t>
       </w:r>
     </w:p>
     <w:p>
@@ -1718,7 +1552,7 @@
         <w:jc w:val="both"/>
       </w:pPr>
       <w:r>
-        <w:t xml:space="preserve">Locale/armadio chiuso per detergenti e prodotti non alimentari</w:t>
+        <w:t xml:space="preserve">Area resi, vuoti e prodotti non conformi, identificata</w:t>
       </w:r>
     </w:p>
     <w:p>
@@ -1732,7 +1566,7 @@
         <w:jc w:val="both"/>
       </w:pPr>
       <w:r>
-        <w:t xml:space="preserve">Area ricarica batterie carrelli (separata dagli alimenti)</w:t>
+        <w:t xml:space="preserve">Piano primo: uffici e deposito accessorio, collegati da scala interna e varco di carico</w:t>
       </w:r>
     </w:p>
     <w:p>
@@ -1746,7 +1580,7 @@
         <w:jc w:val="both"/>
       </w:pPr>
       <w:r>
-        <w:t xml:space="preserve">Uffici, spogliatoio e servizi igienici</w:t>
+        <w:t xml:space="preserve">Servizi igienici</w:t>
       </w:r>
     </w:p>
     <w:p>
@@ -1760,7 +1594,7 @@
         <w:jc w:val="both"/>
       </w:pPr>
       <w:r>
-        <w:t xml:space="preserve">Area raccolta rifiuti e imballaggi</w:t>
+        <w:t xml:space="preserve">Piazzale esterno di manovra per carico/scarico automezzi, con cisterna di gasolio ad uso privato (distante dalle aree di stoccaggio)</w:t>
       </w:r>
     </w:p>
     <w:p>
@@ -1787,7 +1621,7 @@
         <w:jc w:val="both"/>
       </w:pPr>
       <w:r>
-        <w:t xml:space="preserve">Transpallet</w:t>
+        <w:t xml:space="preserve">Carrelli elevatori semoventi</w:t>
       </w:r>
     </w:p>
     <w:p>
@@ -1801,14 +1635,7 @@
         <w:jc w:val="both"/>
       </w:pPr>
       <w:r>
-        <w:t xml:space="preserve">Muletti / carrelli elevatori </w:t>
-      </w:r>
-      <w:r>
-        <w:rPr>
-          <w:highlight w:val="yellow"/>
-          <w:highlightCs w:val="yellow"/>
-        </w:rPr>
-        <w:t xml:space="preserve">elettrici</w:t>
+        <w:t xml:space="preserve">Stoccatori e transpallet elettrici, transpallet manuali</w:t>
       </w:r>
     </w:p>
     <w:p>
@@ -1822,7 +1649,7 @@
         <w:jc w:val="both"/>
       </w:pPr>
       <w:r>
-        <w:t xml:space="preserve">Scaffalature</w:t>
+        <w:t xml:space="preserve">Scaffalature metalliche portapallet</w:t>
       </w:r>
     </w:p>
     <w:p>
@@ -1836,7 +1663,7 @@
         <w:jc w:val="both"/>
       </w:pPr>
       <w:r>
-        <w:t xml:space="preserve">Macchina per la pulizia dei pavimenti (lavasciuga)</w:t>
+        <w:t xml:space="preserve">Attrezzature per la pulizia dei pavimenti</w:t>
       </w:r>
     </w:p>
     <w:p>
@@ -1850,17 +1677,7 @@
         <w:jc w:val="both"/>
       </w:pPr>
       <w:r>
-        <w:t xml:space="preserve">Automezzi per la consegna </w:t>
-      </w:r>
-      <w:r>
-        <w:rPr>
-          <w:highlight w:val="yellow"/>
-          <w:highlightCs w:val="yellow"/>
-        </w:rPr>
-        <w:t xml:space="preserve">n. e tipologia</w:t>
-      </w:r>
-      <w:r>
-        <w:t xml:space="preserve"> – se di proprietà</w:t>
+        <w:t xml:space="preserve">Automezzi per la consegna con sponda idraulica, carrellini</w:t>
       </w:r>
     </w:p>
     <w:p>
@@ -2183,7 +2000,7 @@
                 <w:sz w:val="18"/>
                 <w:szCs w:val="18"/>
               </w:rPr>
-              <w:t xml:space="preserve">Lavasciuga pavimenti, scope, panni, secchi dedicati (distinti per servizi igienici)</w:t>
+              <w:t xml:space="preserve">Attrezzature per pavimenti, scope, panni, secchi dedicati (distinti per servizi igienici)</w:t>
             </w:r>
           </w:p>
         </w:tc>
@@ -2248,7 +2065,7 @@
                 <w:sz w:val="18"/>
                 <w:szCs w:val="18"/>
               </w:rPr>
-              <w:t xml:space="preserve">Pavimenti magazzino: giornaliera (spazzatura) e settimanale (lavasciuga)</w:t>
+              <w:t xml:space="preserve">Pavimenti magazzino: giornaliera (spazzatura) e settimanale (lavaggio)</w:t>
             </w:r>
           </w:p>
           <w:p>
@@ -3040,48 +2857,7 @@
                 <w:sz w:val="18"/>
                 <w:szCs w:val="18"/>
               </w:rPr>
-              <w:t xml:space="preserve">Il servizio è affidato alla ditta specializzata </w:t>
-            </w:r>
-            <w:r>
-              <w:rPr>
-                <w:sz w:val="18"/>
-                <w:szCs w:val="18"/>
-                <w:highlight w:val="yellow"/>
-                <w:highlightCs w:val="yellow"/>
-              </w:rPr>
-              <w:t xml:space="preserve">ragione sociale</w:t>
-            </w:r>
-            <w:r>
-              <w:rPr>
-                <w:sz w:val="18"/>
-                <w:szCs w:val="18"/>
-              </w:rPr>
-              <w:t xml:space="preserve"> che ha installato postazioni numerate (esche all’esterno, trappole meccaniche/collanti all’interno) riportate su planimetria, con </w:t>
-            </w:r>
-            <w:r>
-              <w:rPr>
-                <w:sz w:val="18"/>
-                <w:szCs w:val="18"/>
-                <w:highlight w:val="yellow"/>
-                <w:highlightCs w:val="yellow"/>
-              </w:rPr>
-              <w:t xml:space="preserve">n.</w:t>
-            </w:r>
-            <w:r>
-              <w:rPr>
-                <w:sz w:val="18"/>
-                <w:szCs w:val="18"/>
-              </w:rPr>
-              <w:t xml:space="preserve"> interventi/anno e rilascio di rapporto di intervento. </w:t>
-            </w:r>
-            <w:r>
-              <w:rPr>
-                <w:sz w:val="18"/>
-                <w:szCs w:val="18"/>
-                <w:highlight w:val="yellow"/>
-                <w:highlightCs w:val="yellow"/>
-              </w:rPr>
-              <w:t xml:space="preserve">In alternativa: apparecchi scacciatopi elettronici – specificare</w:t>
+              <w:t xml:space="preserve">Monitoraggio e disinfestazione periodica affidati a ditta specializzata: postazioni con esche numerate e registrate su planimetria (esche rodenticide solo all’esterno o in contenitori chiusi, mai a contatto con i prodotti), allontanamento dei volatili dalle campate, trappole per insetti delle derrate nell’area food (farine). La ditta rilascia rapporto di intervento e schede dei prodotti utilizzati.</w:t>
             </w:r>
           </w:p>
         </w:tc>
@@ -3346,23 +3122,7 @@
                 <w:sz w:val="18"/>
                 <w:szCs w:val="18"/>
               </w:rPr>
-              <w:t xml:space="preserve">Compilare il modulo “Controllo della merce in arrivo” (Modulo 4) e registrare a gestionale </w:t>
-            </w:r>
-            <w:r>
-              <w:rPr>
-                <w:sz w:val="18"/>
-                <w:szCs w:val="18"/>
-                <w:highlight w:val="yellow"/>
-                <w:highlightCs w:val="yellow"/>
-              </w:rPr>
-              <w:t xml:space="preserve">nome software</w:t>
-            </w:r>
-            <w:r>
-              <w:rPr>
-                <w:sz w:val="18"/>
-                <w:szCs w:val="18"/>
-              </w:rPr>
-              <w:t xml:space="preserve"> i lotti e i fornitori.</w:t>
+              <w:t xml:space="preserve">Compilare il modulo “Controllo della merce in arrivo” (Modulo 4) e registrare nel gestionale aziendale i lotti e i fornitori.</w:t>
             </w:r>
           </w:p>
           <w:p>
@@ -4164,16 +3924,7 @@
                 <w:sz w:val="18"/>
                 <w:szCs w:val="18"/>
               </w:rPr>
-              <w:t xml:space="preserve">Ente di formazione accreditato / ASL-AST di appartenenza </w:t>
-            </w:r>
-            <w:r>
-              <w:rPr>
-                <w:sz w:val="18"/>
-                <w:szCs w:val="18"/>
-                <w:highlight w:val="yellow"/>
-                <w:highlightCs w:val="yellow"/>
-              </w:rPr>
-              <w:t xml:space="preserve">specificare</w:t>
+              <w:t xml:space="preserve">Ente di formazione accreditato secondo la normativa della Regione Marche</w:t>
             </w:r>
           </w:p>
         </w:tc>
@@ -4360,17 +4111,7 @@
         <w:jc w:val="both"/>
       </w:pPr>
       <w:r>
-        <w:t xml:space="preserve">Per la ditta: </w:t>
-      </w:r>
-      <w:r>
-        <w:rPr>
-          <w:highlight w:val="yellow"/>
-          <w:highlightCs w:val="yellow"/>
-        </w:rPr>
-        <w:t xml:space="preserve">Nome e Cognome</w:t>
-      </w:r>
-      <w:r>
-        <w:t xml:space="preserve"> (Responsabile dell’autocontrollo)</w:t>
+        <w:t xml:space="preserve">Per la ditta: Sig. Infante Antonio (Responsabile dell’autocontrollo)</w:t>
       </w:r>
     </w:p>
     <w:p>
@@ -4384,35 +4125,7 @@
         <w:jc w:val="both"/>
       </w:pPr>
       <w:r>
-        <w:t xml:space="preserve">Per la sede di Marotta: </w:t>
-      </w:r>
-      <w:r>
-        <w:rPr>
-          <w:highlight w:val="yellow"/>
-          <w:highlightCs w:val="yellow"/>
-        </w:rPr>
-        <w:t xml:space="preserve">Nome e Cognome – preposto/capo magazzino</w:t>
-      </w:r>
-    </w:p>
-    <w:p>
-      <w:pPr>
-        <w:pStyle w:val="ListParagraph"/>
-        <w:numPr>
-          <w:ilvl w:val="0"/>
-          <w:numId w:val="2"/>
-        </w:numPr>
-        <w:spacing w:after="60" w:line="280"/>
-        <w:jc w:val="both"/>
-      </w:pPr>
-      <w:r>
-        <w:t xml:space="preserve">Consulente autocontrollo: </w:t>
-      </w:r>
-      <w:r>
-        <w:rPr>
-          <w:highlight w:val="yellow"/>
-          <w:highlightCs w:val="yellow"/>
-        </w:rPr>
-        <w:t xml:space="preserve">Nome, titolo e recapiti del consulente</w:t>
+        <w:t xml:space="preserve">Per la sede di Marotta: personale di magazzino addetto al ricevimento e allo stoccaggio</w:t>
       </w:r>
     </w:p>
     <w:p>
@@ -4676,7 +4389,7 @@
                 <w:sz w:val="18"/>
                 <w:szCs w:val="18"/>
               </w:rPr>
-              <w:t xml:space="preserve">Bevande e prodotti di generi alimentari confezionati non refrigerati</w:t>
+              <w:t xml:space="preserve">Bevande (acque, birre anche in fusti, bibite, vini, liquori) e generi alimentari confezionati non refrigerati, incluse farine e semilavorati per pizzeria</w:t>
             </w:r>
           </w:p>
         </w:tc>
@@ -4871,7 +4584,7 @@
                 <w:sz w:val="18"/>
                 <w:szCs w:val="18"/>
               </w:rPr>
-              <w:t xml:space="preserve">Magazzino della sede operativa di Marotta</w:t>
+              <w:t xml:space="preserve">Magazzino e zona vendita al dettaglio della sede operativa di Marotta</w:t>
             </w:r>
           </w:p>
         </w:tc>
@@ -4936,7 +4649,7 @@
                 <w:sz w:val="18"/>
                 <w:szCs w:val="18"/>
               </w:rPr>
-              <w:t xml:space="preserve">Consegna al cliente tramite trasporto con mezzi propri o vettori qualificati</w:t>
+              <w:t xml:space="preserve">Consegna a pubblici esercizi e clienti con automezzi aziendali; vendita al dettaglio in sede</w:t>
             </w:r>
           </w:p>
         </w:tc>
@@ -5001,7 +4714,7 @@
                 <w:sz w:val="18"/>
                 <w:szCs w:val="18"/>
               </w:rPr>
-              <w:t xml:space="preserve">Riportata in etichetta (in genere luogo fresco e asciutto, al riparo da luce solare e fonti di calore)</w:t>
+              <w:t xml:space="preserve">Riportata in etichetta (luogo fresco e asciutto, al riparo da luce solare e fonti di calore; farine al riparo dall’umidità)</w:t>
             </w:r>
           </w:p>
         </w:tc>
@@ -5594,7 +5307,7 @@
                 <w:sz w:val="20"/>
                 <w:szCs w:val="20"/>
               </w:rPr>
-              <w:t xml:space="preserve">4. TRASPORTO e CONSEGNA / VENDITA all’ingrosso</w:t>
+              <w:t xml:space="preserve">4. VENDITA al dettaglio in sede / TRASPORTO e CONSEGNA all’ingrosso</w:t>
             </w:r>
           </w:p>
         </w:tc>
@@ -6156,7 +5869,102 @@
                 <w:sz w:val="18"/>
                 <w:szCs w:val="18"/>
               </w:rPr>
-              <w:t xml:space="preserve">Trasporto e vendita</w:t>
+              <w:t xml:space="preserve">Vendita al dettaglio</w:t>
+            </w:r>
+          </w:p>
+        </w:tc>
+        <w:tc>
+          <w:tcPr>
+            <w:tcW w:type="dxa" w:w="7138"/>
+            <w:tcBorders>
+              <w:top w:val="single" w:color="808080" w:sz="4"/>
+              <w:left w:val="single" w:color="808080" w:sz="4"/>
+              <w:bottom w:val="single" w:color="808080" w:sz="4"/>
+              <w:right w:val="single" w:color="808080" w:sz="4"/>
+            </w:tcBorders>
+            <w:tcMar>
+              <w:top w:type="dxa" w:w="50"/>
+              <w:left w:type="dxa" w:w="90"/>
+              <w:bottom w:type="dxa" w:w="50"/>
+              <w:right w:type="dxa" w:w="90"/>
+            </w:tcMar>
+            <w:vAlign w:val="center"/>
+          </w:tcPr>
+          <w:p>
+            <w:pPr>
+              <w:jc w:val="left"/>
+            </w:pPr>
+            <w:r>
+              <w:rPr>
+                <w:sz w:val="18"/>
+                <w:szCs w:val="18"/>
+              </w:rPr>
+              <w:t xml:space="preserve">Vendita al pubblico nella zona dedicata, con controllo dell’integrità delle confezioni e delle scadenze dei prodotti esposti.</w:t>
+            </w:r>
+          </w:p>
+        </w:tc>
+      </w:tr>
+      <w:tr>
+        <w:trPr>
+          <w:tblHeader w:val="false"/>
+        </w:trPr>
+        <w:tc>
+          <w:tcPr>
+            <w:tcW w:type="dxa" w:w="500"/>
+            <w:tcBorders>
+              <w:top w:val="single" w:color="808080" w:sz="4"/>
+              <w:left w:val="single" w:color="808080" w:sz="4"/>
+              <w:bottom w:val="single" w:color="808080" w:sz="4"/>
+              <w:right w:val="single" w:color="808080" w:sz="4"/>
+            </w:tcBorders>
+            <w:tcMar>
+              <w:top w:type="dxa" w:w="50"/>
+              <w:left w:type="dxa" w:w="90"/>
+              <w:bottom w:type="dxa" w:w="50"/>
+              <w:right w:type="dxa" w:w="90"/>
+            </w:tcMar>
+            <w:vAlign w:val="center"/>
+          </w:tcPr>
+          <w:p>
+            <w:pPr>
+              <w:jc w:val="left"/>
+            </w:pPr>
+            <w:r>
+              <w:rPr>
+                <w:sz w:val="18"/>
+                <w:szCs w:val="18"/>
+              </w:rPr>
+              <w:t xml:space="preserve">5</w:t>
+            </w:r>
+          </w:p>
+        </w:tc>
+        <w:tc>
+          <w:tcPr>
+            <w:tcW w:type="dxa" w:w="2000"/>
+            <w:tcBorders>
+              <w:top w:val="single" w:color="808080" w:sz="4"/>
+              <w:left w:val="single" w:color="808080" w:sz="4"/>
+              <w:bottom w:val="single" w:color="808080" w:sz="4"/>
+              <w:right w:val="single" w:color="808080" w:sz="4"/>
+            </w:tcBorders>
+            <w:tcMar>
+              <w:top w:type="dxa" w:w="50"/>
+              <w:left w:type="dxa" w:w="90"/>
+              <w:bottom w:type="dxa" w:w="50"/>
+              <w:right w:type="dxa" w:w="90"/>
+            </w:tcMar>
+            <w:vAlign w:val="center"/>
+          </w:tcPr>
+          <w:p>
+            <w:pPr>
+              <w:jc w:val="left"/>
+            </w:pPr>
+            <w:r>
+              <w:rPr>
+                <w:sz w:val="18"/>
+                <w:szCs w:val="18"/>
+              </w:rPr>
+              <w:t xml:space="preserve">Trasporto e vendita all’ingrosso</w:t>
             </w:r>
           </w:p>
         </w:tc>
@@ -6625,7 +6433,7 @@
                 <w:sz w:val="17"/>
                 <w:szCs w:val="17"/>
               </w:rPr>
-              <w:t xml:space="preserve">– Infestanti</w:t>
+              <w:t xml:space="preserve">– Infestanti (roditori, volatili, insetti delle farine)</w:t>
             </w:r>
           </w:p>
           <w:p>
@@ -6637,7 +6445,7 @@
                 <w:sz w:val="17"/>
                 <w:szCs w:val="17"/>
               </w:rPr>
-              <w:t xml:space="preserve">– Contaminazione chimica da detergenti/carburanti</w:t>
+              <w:t xml:space="preserve">– Rottura sacchi di farina e assorbimento di umidità/odori (area food)</w:t>
             </w:r>
           </w:p>
           <w:p>
@@ -6649,7 +6457,7 @@
                 <w:sz w:val="17"/>
                 <w:szCs w:val="17"/>
               </w:rPr>
-              <w:t xml:space="preserve">– Alterazione per calore o luce solare</w:t>
+              <w:t xml:space="preserve">– Contaminazione chimica da detergenti/carburanti</w:t>
             </w:r>
           </w:p>
           <w:p>
@@ -6661,27 +6469,9 @@
                 <w:sz w:val="17"/>
                 <w:szCs w:val="17"/>
               </w:rPr>
-              <w:t xml:space="preserve">– Superamento della data di scadenza</w:t>
-            </w:r>
-          </w:p>
-        </w:tc>
-        <w:tc>
-          <w:tcPr>
-            <w:tcW w:type="dxa" w:w="3238"/>
-            <w:tcBorders>
-              <w:top w:val="single" w:color="808080" w:sz="4"/>
-              <w:left w:val="single" w:color="808080" w:sz="4"/>
-              <w:bottom w:val="single" w:color="808080" w:sz="4"/>
-              <w:right w:val="single" w:color="808080" w:sz="4"/>
-            </w:tcBorders>
-            <w:tcMar>
-              <w:top w:type="dxa" w:w="50"/>
-              <w:left w:type="dxa" w:w="90"/>
-              <w:bottom w:type="dxa" w:w="50"/>
-              <w:right w:type="dxa" w:w="90"/>
-            </w:tcMar>
-            <w:vAlign w:val="center"/>
-          </w:tcPr>
+              <w:t xml:space="preserve">– Alterazione per calore o luce solare</w:t>
+            </w:r>
+          </w:p>
           <w:p>
             <w:pPr>
               <w:jc w:val="left"/>
@@ -6691,7 +6481,49 @@
                 <w:sz w:val="17"/>
                 <w:szCs w:val="17"/>
               </w:rPr>
+              <w:t xml:space="preserve">– Superamento della data di scadenza</w:t>
+            </w:r>
+          </w:p>
+        </w:tc>
+        <w:tc>
+          <w:tcPr>
+            <w:tcW w:type="dxa" w:w="3238"/>
+            <w:tcBorders>
+              <w:top w:val="single" w:color="808080" w:sz="4"/>
+              <w:left w:val="single" w:color="808080" w:sz="4"/>
+              <w:bottom w:val="single" w:color="808080" w:sz="4"/>
+              <w:right w:val="single" w:color="808080" w:sz="4"/>
+            </w:tcBorders>
+            <w:tcMar>
+              <w:top w:type="dxa" w:w="50"/>
+              <w:left w:type="dxa" w:w="90"/>
+              <w:bottom w:type="dxa" w:w="50"/>
+              <w:right w:type="dxa" w:w="90"/>
+            </w:tcMar>
+            <w:vAlign w:val="center"/>
+          </w:tcPr>
+          <w:p>
+            <w:pPr>
+              <w:jc w:val="left"/>
+            </w:pPr>
+            <w:r>
+              <w:rPr>
+                <w:sz w:val="17"/>
+                <w:szCs w:val="17"/>
+              </w:rPr>
               <w:t xml:space="preserve">– Piano di pulizia (SOP 1) e di controllo infestanti (SOP 3)</w:t>
+            </w:r>
+          </w:p>
+          <w:p>
+            <w:pPr>
+              <w:jc w:val="left"/>
+            </w:pPr>
+            <w:r>
+              <w:rPr>
+                <w:sz w:val="17"/>
+                <w:szCs w:val="17"/>
+              </w:rPr>
+              <w:t xml:space="preserve">– Area food dedicata, separata da bombole CO2, carburanti e ricarica batterie</w:t>
             </w:r>
           </w:p>
           <w:p>
@@ -6901,6 +6733,155 @@
                 <w:szCs w:val="17"/>
               </w:rPr>
               <w:t xml:space="preserve">– Pulizia automezzi (SOP 1)</w:t>
+            </w:r>
+          </w:p>
+        </w:tc>
+        <w:tc>
+          <w:tcPr>
+            <w:tcW w:type="dxa" w:w="1200"/>
+            <w:tcBorders>
+              <w:top w:val="single" w:color="808080" w:sz="4"/>
+              <w:left w:val="single" w:color="808080" w:sz="4"/>
+              <w:bottom w:val="single" w:color="808080" w:sz="4"/>
+              <w:right w:val="single" w:color="808080" w:sz="4"/>
+            </w:tcBorders>
+            <w:tcMar>
+              <w:top w:type="dxa" w:w="50"/>
+              <w:left w:type="dxa" w:w="90"/>
+              <w:bottom w:type="dxa" w:w="50"/>
+              <w:right w:type="dxa" w:w="90"/>
+            </w:tcMar>
+            <w:vAlign w:val="center"/>
+          </w:tcPr>
+          <w:p>
+            <w:pPr>
+              <w:jc w:val="left"/>
+            </w:pPr>
+            <w:r>
+              <w:rPr>
+                <w:sz w:val="17"/>
+                <w:szCs w:val="17"/>
+              </w:rPr>
+              <w:t xml:space="preserve">/</w:t>
+            </w:r>
+          </w:p>
+        </w:tc>
+      </w:tr>
+      <w:tr>
+        <w:trPr>
+          <w:tblHeader w:val="false"/>
+        </w:trPr>
+        <w:tc>
+          <w:tcPr>
+            <w:tcW w:type="dxa" w:w="1900"/>
+            <w:tcBorders>
+              <w:top w:val="single" w:color="808080" w:sz="4"/>
+              <w:left w:val="single" w:color="808080" w:sz="4"/>
+              <w:bottom w:val="single" w:color="808080" w:sz="4"/>
+              <w:right w:val="single" w:color="808080" w:sz="4"/>
+            </w:tcBorders>
+            <w:tcMar>
+              <w:top w:type="dxa" w:w="50"/>
+              <w:left w:type="dxa" w:w="90"/>
+              <w:bottom w:type="dxa" w:w="50"/>
+              <w:right w:type="dxa" w:w="90"/>
+            </w:tcMar>
+            <w:vAlign w:val="center"/>
+          </w:tcPr>
+          <w:p>
+            <w:pPr>
+              <w:jc w:val="left"/>
+            </w:pPr>
+            <w:r>
+              <w:rPr>
+                <w:sz w:val="17"/>
+                <w:szCs w:val="17"/>
+              </w:rPr>
+              <w:t xml:space="preserve">Vendita al dettaglio in sede</w:t>
+            </w:r>
+          </w:p>
+        </w:tc>
+        <w:tc>
+          <w:tcPr>
+            <w:tcW w:type="dxa" w:w="3300"/>
+            <w:tcBorders>
+              <w:top w:val="single" w:color="808080" w:sz="4"/>
+              <w:left w:val="single" w:color="808080" w:sz="4"/>
+              <w:bottom w:val="single" w:color="808080" w:sz="4"/>
+              <w:right w:val="single" w:color="808080" w:sz="4"/>
+            </w:tcBorders>
+            <w:tcMar>
+              <w:top w:type="dxa" w:w="50"/>
+              <w:left w:type="dxa" w:w="90"/>
+              <w:bottom w:type="dxa" w:w="50"/>
+              <w:right w:type="dxa" w:w="90"/>
+            </w:tcMar>
+            <w:vAlign w:val="center"/>
+          </w:tcPr>
+          <w:p>
+            <w:pPr>
+              <w:jc w:val="left"/>
+            </w:pPr>
+            <w:r>
+              <w:rPr>
+                <w:sz w:val="17"/>
+                <w:szCs w:val="17"/>
+              </w:rPr>
+              <w:t xml:space="preserve">– Vendita di prodotti scaduti o con confezioni danneggiate</w:t>
+            </w:r>
+          </w:p>
+          <w:p>
+            <w:pPr>
+              <w:jc w:val="left"/>
+            </w:pPr>
+            <w:r>
+              <w:rPr>
+                <w:sz w:val="17"/>
+                <w:szCs w:val="17"/>
+              </w:rPr>
+              <w:t xml:space="preserve">– Interferenza dei mezzi di movimentazione con i clienti</w:t>
+            </w:r>
+          </w:p>
+        </w:tc>
+        <w:tc>
+          <w:tcPr>
+            <w:tcW w:type="dxa" w:w="3238"/>
+            <w:tcBorders>
+              <w:top w:val="single" w:color="808080" w:sz="4"/>
+              <w:left w:val="single" w:color="808080" w:sz="4"/>
+              <w:bottom w:val="single" w:color="808080" w:sz="4"/>
+              <w:right w:val="single" w:color="808080" w:sz="4"/>
+            </w:tcBorders>
+            <w:tcMar>
+              <w:top w:type="dxa" w:w="50"/>
+              <w:left w:type="dxa" w:w="90"/>
+              <w:bottom w:type="dxa" w:w="50"/>
+              <w:right w:type="dxa" w:w="90"/>
+            </w:tcMar>
+            <w:vAlign w:val="center"/>
+          </w:tcPr>
+          <w:p>
+            <w:pPr>
+              <w:jc w:val="left"/>
+            </w:pPr>
+            <w:r>
+              <w:rPr>
+                <w:sz w:val="17"/>
+                <w:szCs w:val="17"/>
+              </w:rPr>
+              <w:t xml:space="preserve">– Controllo scadenze e integrità in esposizione</w:t>
+            </w:r>
+          </w:p>
+          <w:p>
+            <w:pPr>
+              <w:jc w:val="left"/>
+            </w:pPr>
+            <w:r>
+              <w:rPr>
+                <w:sz w:val="17"/>
+                <w:szCs w:val="17"/>
+              </w:rPr>
+              <w:t xml:space="preserve">– Percorsi clienti delimitati, nessuna movimentazione con mezzi durante l’apertura</w:t>
             </w:r>
           </w:p>
         </w:tc>
@@ -8316,7 +8297,7 @@
         <w:jc w:val="both"/>
       </w:pPr>
       <w:r>
-        <w:t xml:space="preserve">Il Responsabile dell’autocontrollo ha il compito di pianificare le verifiche ispettive (almeno annuali) e convocare i componenti del gruppo alle date previste, informando il consulente per l’esecuzione della verifica. La verifica comprende:</w:t>
+        <w:t xml:space="preserve">Il Responsabile dell’autocontrollo ha il compito di pianificare le verifiche ispettive (almeno annuali) e convocare i componenti del gruppo alle date previste, avvalendosi ove necessario di un tecnico esterno. La verifica comprende:</w:t>
       </w:r>
     </w:p>
     <w:p>
@@ -30133,18 +30114,7 @@
         <w:sz w:val="16"/>
         <w:szCs w:val="16"/>
       </w:rPr>
-      <w:t xml:space="preserve">Piano di autocontrollo HACCP – Revisione del </w:t>
-    </w:r>
-    <w:r>
-      <w:rPr>
-        <w:i/>
-        <w:iCs/>
-        <w:sz w:val="16"/>
-        <w:szCs w:val="16"/>
-        <w:highlight w:val="yellow"/>
-        <w:highlightCs w:val="yellow"/>
-      </w:rPr>
-      <w:t xml:space="preserve">gg/mm/2026</w:t>
+      <w:t xml:space="preserve">Piano di autocontrollo HACCP – Rev. 0 del 02/07/2026</w:t>
     </w:r>
   </w:p>
 </w:hdr>

</xml_diff>